<commit_message>
Enhancing UI and building Audit Toll UI
</commit_message>
<xml_diff>
--- a/pages/assets/samples/moneer-sample-khutbah.docx
+++ b/pages/assets/samples/moneer-sample-khutbah.docx
@@ -156,6 +156,42 @@
           <w:szCs w:val="32"/>
         </w:rPr>
         <w:t>عَنْ صُهَيْبٍ رضي الله عنه قَالَ: قَالَ رَسُولُ اللهِ صَلَّى اللهُ عَلَيْهِ وَسَلَّمَ: «عَجَبًا لِأَمْرِ الْمُؤْمِنِ، إِنَّ أَمْرَهُ كُلَّهُ خَيْرٌ، وَلَيْسَ ذَاكَ لِأَحَدٍ إِلَّا لِلْمُؤْمِنِ، إِنْ أَصَابَتْهُ سَرَّاءُ شَكَرَ، فَكَانَ خَيْرًا لَهُ، وَإِنْ أَصَابَتْهُ ضَرَّاءُ صَبَرَ، فَكَانَ خَيْرًا لَهُ». رواه مسلم.</w:t>
+      </w:r>
+    </w:p>
+    <w:p>
+      <w:pPr>
+        <w:pStyle w:val="Heading1"/>
+        <w:bidi/>
+        <w:spacing w:after="160"/>
+        <w:jc w:val="right"/>
+      </w:pPr>
+      <w:r>
+        <w:rPr>
+          <w:rFonts w:ascii="Traditional Arabic" w:hAnsi="Traditional Arabic" w:cs="Traditional Arabic"/>
+          <w:b/>
+          <w:color w:val="2464EC"/>
+          <w:sz w:val="40"/>
+          <w:rtl/>
+          <w:szCs w:val="40"/>
+          <w:bCs/>
+        </w:rPr>
+        <w:t>من أقوال الصحابة</w:t>
+      </w:r>
+    </w:p>
+    <w:p>
+      <w:pPr>
+        <w:bidi/>
+        <w:spacing w:after="160"/>
+        <w:jc w:val="both"/>
+      </w:pPr>
+      <w:r>
+        <w:rPr>
+          <w:rFonts w:ascii="Traditional Arabic" w:hAnsi="Traditional Arabic" w:cs="Traditional Arabic"/>
+          <w:sz w:val="32"/>
+          <w:rtl/>
+          <w:szCs w:val="32"/>
+        </w:rPr>
+        <w:t>ومن الصبر اغتنام العمر في الطاعة، وكان عبد الله بن عمر رضي الله عنهما يقول: «إِذَا أَمْسَيْتَ فَلاَ تَنْتَظِرِ الصَّبَاحَ، وَإِذَا أَصْبَحْتَ فَلاَ تَنْتَظِرِ المَسَاءَ، وَخُذْ مِنْ صِحَّتِكَ لِمَرَضِكَ، وَمِنْ حَيَاتِكَ لِمَوْتِكَ». رواه البخاري.</w:t>
       </w:r>
     </w:p>
     <w:p>

</xml_diff>